<commit_message>
Refresh combined print packets with manual formatting tweaks applied.
Rebuilt all 3 per-segment combined PDFs and Printer_Instructions sheet
after pulling in the artifact packet covers and worksheets edits from
the previous main-folder commit. GTM packet compressed from 36 to 35
pages (GTM cover now 1 page). Printer instructions auto-corrected.

Co-Authored-By: Claude Opus 4.7 (1M context) <noreply@anthropic.com>
</commit_message>
<xml_diff>
--- a/Focus Group Materials/Print Packets/Printer_Instructions.docx
+++ b/Focus Group Materials/Print Packets/Printer_Instructions.docx
@@ -44,7 +44,7 @@
         <w:t xml:space="preserve">Total print run: </w:t>
       </w:r>
       <w:r>
-        <w:t>14 attendee packets, 398 total pages.</w:t>
+        <w:t>14 attendee packets, 394 total pages.</w:t>
       </w:r>
     </w:p>
     <w:p>
@@ -106,7 +106,7 @@
         <w:t xml:space="preserve">File: </w:t>
       </w:r>
       <w:r>
-        <w:t>GTM_Packet.pdf Total pages:         36 Quantity needed:     4 copies Cover stock pages:   Pages 8-9 (2 pages on segment-colored cover stock) Cover stock color:   Amber / burnt orange (strategy / commerce tone) Cover stock weight:  60-80 lb Body paper:          Standard 20-24 lb white Color printing:      Required for entire packet Binding:             Stapled top-left corner OR paperclip</w:t>
+        <w:t>GTM_Packet.pdf Total pages:         35 Quantity needed:     4 copies Cover stock pages:   Page 8 (1 page on segment-colored cover stock) Cover stock color:   Amber / burnt orange (strategy / commerce tone) Cover stock weight:  60-80 lb Body paper:          Standard 20-24 lb white Color printing:      Required for entire packet Binding:             Stapled top-left corner OR paperclip</w:t>
       </w:r>
     </w:p>
     <w:p>

</xml_diff>